<commit_message>
small fix and finalizing it
</commit_message>
<xml_diff>
--- a/StudentPerformance/documentation/student_performance_report.docx
+++ b/StudentPerformance/documentation/student_performance_report.docx
@@ -3281,8 +3281,6 @@
           <w:lang w:val="en-US"/>
         </w:rPr>
       </w:pPr>
-      <w:bookmarkStart w:id="21" w:name="_GoBack"/>
-      <w:bookmarkEnd w:id="21"/>
     </w:p>
     <w:p>
       <w:pPr>
@@ -11655,7 +11653,7 @@
           <w:szCs w:val="24"/>
           <w:lang w:val="en-US"/>
         </w:rPr>
-        <w:t xml:space="preserve">Student Performance Data Set by UCI. (2020). Kaggle. </w:t>
+        <w:t xml:space="preserve"> </w:t>
       </w:r>
       <w:r>
         <w:rPr>
@@ -11711,6 +11709,8 @@
         </w:rPr>
         <w:t xml:space="preserve">. </w:t>
       </w:r>
+      <w:bookmarkStart w:id="21" w:name="_GoBack"/>
+      <w:bookmarkEnd w:id="21"/>
       <w:r>
         <w:rPr>
           <w:rFonts w:hint="default" w:ascii="Times New Roman" w:hAnsi="Times New Roman" w:cs="Times New Roman"/>

</xml_diff>